<commit_message>
adjusted models and documents
</commit_message>
<xml_diff>
--- a/docs/rapport/Rapport.docx
+++ b/docs/rapport/Rapport.docx
@@ -6626,25 +6626,20 @@
     <w:p>
       <w:pPr>
         <w:pStyle w:val="Heading2"/>
+        <w:rPr>
+          <w:lang w:val="en-US"/>
+        </w:rPr>
       </w:pPr>
       <w:bookmarkStart w:id="8" w:name="_Toc223008645"/>
       <w:r>
         <w:rPr>
           <w:sz w:val="24"/>
           <w:szCs w:val="24"/>
-        </w:rPr>
-        <w:t xml:space="preserve">III.  </w:t>
-      </w:r>
-      <w:proofErr w:type="spellStart"/>
-      <w:r>
-        <w:rPr>
-          <w:sz w:val="24"/>
-          <w:szCs w:val="24"/>
-        </w:rPr>
-        <w:t>Methodology</w:t>
+          <w:lang w:val="en-US"/>
+        </w:rPr>
+        <w:t>III.  Methodology</w:t>
       </w:r>
       <w:bookmarkEnd w:id="8"/>
-      <w:proofErr w:type="spellEnd"/>
     </w:p>
     <w:p>
       <w:pPr>
@@ -23704,6 +23699,7 @@
   <w:style w:type="character" w:default="1" w:styleId="DefaultParagraphFont">
     <w:name w:val="Default Paragraph Font"/>
     <w:uiPriority w:val="1"/>
+    <w:semiHidden/>
     <w:unhideWhenUsed/>
   </w:style>
   <w:style w:type="table" w:default="1" w:styleId="TableNormal">

</xml_diff>